<commit_message>
Added / Updated vSTB sections
</commit_message>
<xml_diff>
--- a/docs/Sprint Report 5.docx
+++ b/docs/Sprint Report 5.docx
@@ -285,9 +285,11 @@
           <w:numId w:val="2"/>
         </w:numPr>
       </w:pPr>
+      <w:proofErr w:type="spellStart"/>
       <w:r>
         <w:t>ICommunication</w:t>
       </w:r>
+      <w:proofErr w:type="spellEnd"/>
     </w:p>
     <w:p>
       <w:pPr>
@@ -297,9 +299,11 @@
           <w:numId w:val="2"/>
         </w:numPr>
       </w:pPr>
+      <w:proofErr w:type="spellStart"/>
       <w:r>
         <w:t>IDatabase</w:t>
       </w:r>
+      <w:proofErr w:type="spellEnd"/>
     </w:p>
     <w:p>
       <w:pPr>
@@ -309,9 +313,11 @@
           <w:numId w:val="2"/>
         </w:numPr>
       </w:pPr>
+      <w:proofErr w:type="spellStart"/>
       <w:r>
         <w:t>ISerializer</w:t>
       </w:r>
+      <w:proofErr w:type="spellEnd"/>
     </w:p>
     <w:p>
       <w:pPr>
@@ -321,9 +327,11 @@
           <w:numId w:val="2"/>
         </w:numPr>
       </w:pPr>
+      <w:proofErr w:type="spellStart"/>
       <w:r>
         <w:t>IGameFactory</w:t>
       </w:r>
+      <w:proofErr w:type="spellEnd"/>
     </w:p>
     <w:p>
       <w:pPr>
@@ -334,8 +342,21 @@
         </w:numPr>
       </w:pPr>
       <w:r>
-        <w:t>Write method to convert two full gamestates into an update gamestate</w:t>
-      </w:r>
+        <w:t xml:space="preserve">Write method to convert two full </w:t>
+      </w:r>
+      <w:proofErr w:type="spellStart"/>
+      <w:r>
+        <w:t>gamestates</w:t>
+      </w:r>
+      <w:proofErr w:type="spellEnd"/>
+      <w:r>
+        <w:t xml:space="preserve"> into an update </w:t>
+      </w:r>
+      <w:proofErr w:type="spellStart"/>
+      <w:r>
+        <w:t>gamestate</w:t>
+      </w:r>
+      <w:proofErr w:type="spellEnd"/>
     </w:p>
     <w:p>
       <w:pPr>
@@ -382,8 +403,21 @@
         </w:numPr>
       </w:pPr>
       <w:r>
-        <w:t>Refactor IMPGameInterface to be called IMPBoardGameInterface</w:t>
-      </w:r>
+        <w:t xml:space="preserve">Refactor </w:t>
+      </w:r>
+      <w:proofErr w:type="spellStart"/>
+      <w:r>
+        <w:t>IMPGameInterface</w:t>
+      </w:r>
+      <w:proofErr w:type="spellEnd"/>
+      <w:r>
+        <w:t xml:space="preserve"> to be called </w:t>
+      </w:r>
+      <w:proofErr w:type="spellStart"/>
+      <w:r>
+        <w:t>IMPBoardGameInterface</w:t>
+      </w:r>
+      <w:proofErr w:type="spellEnd"/>
     </w:p>
     <w:p>
       <w:pPr>
@@ -394,7 +428,15 @@
         </w:numPr>
       </w:pPr>
       <w:r>
-        <w:t>Research Moq and other object mocking frameworks for .NET</w:t>
+        <w:t xml:space="preserve">Research </w:t>
+      </w:r>
+      <w:proofErr w:type="spellStart"/>
+      <w:r>
+        <w:t>Moq</w:t>
+      </w:r>
+      <w:proofErr w:type="spellEnd"/>
+      <w:r>
+        <w:t xml:space="preserve"> and other object mocking frameworks for .NET</w:t>
       </w:r>
     </w:p>
     <w:p>
@@ -414,7 +456,15 @@
         </w:numPr>
       </w:pPr>
       <w:r>
-        <w:t>Redo sendmove, forfeit, pause/resume logic</w:t>
+        <w:t xml:space="preserve">Redo </w:t>
+      </w:r>
+      <w:proofErr w:type="spellStart"/>
+      <w:r>
+        <w:t>sendmove</w:t>
+      </w:r>
+      <w:proofErr w:type="spellEnd"/>
+      <w:r>
+        <w:t>, forfeit, pause/resume logic</w:t>
       </w:r>
     </w:p>
     <w:p>
@@ -425,8 +475,13 @@
           <w:numId w:val="3"/>
         </w:numPr>
       </w:pPr>
-      <w:r>
-        <w:t>Udp resource handler for large files</w:t>
+      <w:proofErr w:type="spellStart"/>
+      <w:r>
+        <w:t>Udp</w:t>
+      </w:r>
+      <w:proofErr w:type="spellEnd"/>
+      <w:r>
+        <w:t xml:space="preserve"> resource handler for large files</w:t>
       </w:r>
     </w:p>
     <w:p>
@@ -486,7 +541,15 @@
         </w:numPr>
       </w:pPr>
       <w:r>
-        <w:t>Fix request serializer bug</w:t>
+        <w:t xml:space="preserve">Fix request </w:t>
+      </w:r>
+      <w:proofErr w:type="spellStart"/>
+      <w:r>
+        <w:t>serializer</w:t>
+      </w:r>
+      <w:proofErr w:type="spellEnd"/>
+      <w:r>
+        <w:t xml:space="preserve"> bug</w:t>
       </w:r>
     </w:p>
     <w:p>
@@ -590,8 +653,13 @@
           <w:numId w:val="4"/>
         </w:numPr>
       </w:pPr>
-      <w:r>
-        <w:t>Init game board</w:t>
+      <w:proofErr w:type="spellStart"/>
+      <w:r>
+        <w:t>Init</w:t>
+      </w:r>
+      <w:proofErr w:type="spellEnd"/>
+      <w:r>
+        <w:t xml:space="preserve"> game board</w:t>
       </w:r>
     </w:p>
     <w:p>
@@ -602,8 +670,13 @@
           <w:numId w:val="4"/>
         </w:numPr>
       </w:pPr>
-      <w:r>
-        <w:t>Init game state</w:t>
+      <w:proofErr w:type="spellStart"/>
+      <w:r>
+        <w:t>Init</w:t>
+      </w:r>
+      <w:proofErr w:type="spellEnd"/>
+      <w:r>
+        <w:t xml:space="preserve"> game state</w:t>
       </w:r>
     </w:p>
     <w:p>
@@ -692,7 +765,23 @@
     </w:p>
     <w:p>
       <w:r>
-        <w:t>On the server, David began unit testing using Moq and dependency injection, where dependencies such as using the database, communicating over sockets, and serializing messages, are injected into the code using interfaces. This allows Moq to fake implementation and for much less work to be done to unit test portions of code.</w:t>
+        <w:t xml:space="preserve">On the server, David began unit testing using </w:t>
+      </w:r>
+      <w:proofErr w:type="spellStart"/>
+      <w:r>
+        <w:t>Moq</w:t>
+      </w:r>
+      <w:proofErr w:type="spellEnd"/>
+      <w:r>
+        <w:t xml:space="preserve"> and dependency injection, where dependencies such as using the database, communicating over sockets, and serializing messages, are injected into the code using interfaces. This allows </w:t>
+      </w:r>
+      <w:proofErr w:type="spellStart"/>
+      <w:r>
+        <w:t>Moq</w:t>
+      </w:r>
+      <w:proofErr w:type="spellEnd"/>
+      <w:r>
+        <w:t xml:space="preserve"> to fake implementation and for much less work to be done to unit test portions of code.</w:t>
       </w:r>
     </w:p>
     <w:p>
@@ -774,89 +863,238 @@
     </w:p>
     <w:p>
       <w:r>
-        <w:t>There a couple of bugs that need to be taken care of yet, such as crashes when a second game is started after the first one finishes. The only major feature that we need to implement yet is drawing around the currently selected tile and using a remote control and arrow keys to move the selected area around the board. Once all the features are added, Marshall will begin to write some unit tests.</w:t>
-      </w:r>
-    </w:p>
-    <w:p>
-      <w:pPr>
-        <w:pStyle w:val="Heading1"/>
-      </w:pPr>
-      <w:r>
-        <w:t>Research/Code Experiments</w:t>
-      </w:r>
-    </w:p>
-    <w:p>
-      <w:pPr>
-        <w:pStyle w:val="Heading2"/>
-      </w:pPr>
-      <w:r>
-        <w:t>Server Unit Testing</w:t>
-      </w:r>
-    </w:p>
-    <w:p>
-      <w:r>
-        <w:t xml:space="preserve">David researched Moq this sprint, which is a .NET mocking library for unit testing. Once Moq was finally integrated into the project (using NuGet), it became a challenge to write unit tests, since the database had to be connected and communications would fail when there was no </w:t>
-      </w:r>
-      <w:r>
-        <w:t xml:space="preserve">client to receive the messages being sent. More research into writing unit testable code produced the concept of dependency injection. The idea is that rather than using the actual class name of the code to send messages or use the database, one would use an interface with all the same methods on it, and then the class you would normally use implements that interface. At runtime, there is no difference, but when unit testing, you can use libraries like Moq to “mock” the implementation of the dependency. For instance, when calling to the database to add a state, one would just mock the IDatabase interface to return true, and when you want to get the state back, you mock IDatabase again to return some phony object that you would normally expect at runtime. </w:t>
-      </w:r>
-      <w:r>
-        <w:t>This allows for the unit tests to actually test the method, and not the dependencies that method uses.</w:t>
-      </w:r>
-    </w:p>
-    <w:p>
-      <w:pPr>
-        <w:pStyle w:val="Heading2"/>
-      </w:pPr>
-      <w:r>
-        <w:t>Virtual STB Refactoring</w:t>
-      </w:r>
-    </w:p>
-    <w:p>
-      <w:r>
-        <w:t xml:space="preserve">While the server was being developed, Marshall was forced to stub methods and hardcode data until the server could produce real results that could be tested against. After many months of doing this, some refactoring had to be done to use real data from the server. David helped out with this by moving some of the protocol definitions into separate files and grouping those files into common folders. This improved some of the organization of the vSTB, as well as speeding up compilation time. </w:t>
-      </w:r>
-    </w:p>
-    <w:p>
-      <w:pPr>
-        <w:pStyle w:val="Heading2"/>
-      </w:pPr>
-      <w:r>
-        <w:t>Virtual STB Drawing</w:t>
-      </w:r>
-    </w:p>
-    <w:p>
-      <w:r>
-        <w:t xml:space="preserve">To get checkers pieces to look like they are sitting on top of the board, Marshall had to look into drawing the images on top of each other, and doing so in an efficient way. </w:t>
-      </w:r>
-      <w:r>
-        <w:t>The end result was a very nice looking board where the piece images could be dynamically drawn on top of the tile images.</w:t>
-      </w:r>
-    </w:p>
-    <w:p>
-      <w:pPr>
-        <w:pStyle w:val="Heading2"/>
-      </w:pPr>
-      <w:r>
-        <w:t>Checkers A.I.</w:t>
-      </w:r>
-    </w:p>
-    <w:p>
-      <w:r>
-        <w:t xml:space="preserve">Kevin has taken the Artificial Intelligence class on campus, so he was the obvious candidate to write the checkers AI portion. </w:t>
-      </w:r>
-      <w:r>
-        <w:t xml:space="preserve">In only a couple of days he had a fully working analyzer that would look three </w:t>
-      </w:r>
-      <w:r>
-        <w:lastRenderedPageBreak/>
-        <w:t xml:space="preserve">moves ahead and decide which move to pick. This level of difficulty is fairly easy to beat, but any more moves ahead causes a drastic increase in computation. He then looked into more optimizations and remembered what he had learned about Alpha Beta pruning, and had </w:t>
-      </w:r>
-      <w:r>
-        <w:t>that</w:t>
+        <w:t xml:space="preserve">There a couple of bugs that need to be taken care of yet, such as crashes when a second game is started after the first one finishes. </w:t>
+      </w:r>
+      <w:r>
+        <w:t xml:space="preserve">Also taking the existing </w:t>
+      </w:r>
+      <w:proofErr w:type="spellStart"/>
+      <w:r>
+        <w:t>vSTB</w:t>
+      </w:r>
+      <w:proofErr w:type="spellEnd"/>
+      <w:r>
+        <w:t xml:space="preserve"> database class and changing the connection and query statements to match the existing database schema. This will provide one central database for all errors, warnings, and issues generated by the </w:t>
+      </w:r>
+      <w:proofErr w:type="spellStart"/>
+      <w:r>
+        <w:t>vSTB</w:t>
+      </w:r>
+      <w:proofErr w:type="spellEnd"/>
+      <w:r>
+        <w:t xml:space="preserve">. </w:t>
       </w:r>
       <w:bookmarkStart w:id="0" w:name="_GoBack"/>
       <w:bookmarkEnd w:id="0"/>
+      <w:r>
+        <w:t>The only major feature</w:t>
+      </w:r>
+      <w:r>
+        <w:t xml:space="preserve"> that still needs to be </w:t>
+      </w:r>
+      <w:r>
+        <w:t>implemented</w:t>
+      </w:r>
+      <w:r>
+        <w:t xml:space="preserve"> </w:t>
+      </w:r>
+      <w:r>
+        <w:t xml:space="preserve">is </w:t>
+      </w:r>
+      <w:r>
+        <w:t>using a remote control and arrow keys to move the selected area around the board. Once all the features are added, Marshall will begin to write some unit tests.</w:t>
+      </w:r>
+    </w:p>
+    <w:p>
+      <w:pPr>
+        <w:pStyle w:val="Heading1"/>
+      </w:pPr>
+      <w:r>
+        <w:t>Research/Code Experiments</w:t>
+      </w:r>
+    </w:p>
+    <w:p>
+      <w:pPr>
+        <w:pStyle w:val="Heading2"/>
+      </w:pPr>
+      <w:r>
+        <w:t>Server Unit Testing</w:t>
+      </w:r>
+    </w:p>
+    <w:p>
+      <w:r>
+        <w:t xml:space="preserve">David researched </w:t>
+      </w:r>
+      <w:proofErr w:type="spellStart"/>
+      <w:r>
+        <w:t>Moq</w:t>
+      </w:r>
+      <w:proofErr w:type="spellEnd"/>
+      <w:r>
+        <w:t xml:space="preserve"> this sprint, which is a .NET mocking library for unit testing. Once </w:t>
+      </w:r>
+      <w:proofErr w:type="spellStart"/>
+      <w:r>
+        <w:t>Moq</w:t>
+      </w:r>
+      <w:proofErr w:type="spellEnd"/>
+      <w:r>
+        <w:t xml:space="preserve"> was finally integrated into the project (using </w:t>
+      </w:r>
+      <w:proofErr w:type="spellStart"/>
+      <w:r>
+        <w:t>NuGet</w:t>
+      </w:r>
+      <w:proofErr w:type="spellEnd"/>
+      <w:r>
+        <w:t xml:space="preserve">), it became a challenge to write unit tests, since the database had to be connected and communications would fail when there was no </w:t>
+      </w:r>
+      <w:r>
+        <w:t xml:space="preserve">client to receive the messages being </w:t>
+      </w:r>
+      <w:proofErr w:type="gramStart"/>
+      <w:r>
+        <w:t>sent.</w:t>
+      </w:r>
+      <w:proofErr w:type="gramEnd"/>
+      <w:r>
+        <w:t xml:space="preserve"> More research into writing unit testable code produced the concept of dependency injection. The idea is that rather than using the actual class name of the code to send messages or use the database, one would use an interface with all the same methods on it, and then the class you would normally use implements that interface. At runtime, there is no difference, but when unit testing, you can use libraries like </w:t>
+      </w:r>
+      <w:proofErr w:type="spellStart"/>
+      <w:r>
+        <w:t>Moq</w:t>
+      </w:r>
+      <w:proofErr w:type="spellEnd"/>
+      <w:r>
+        <w:t xml:space="preserve"> to “mock” the implementation of the dependency. For instance, when calling to the database to add a state, one would just mock the </w:t>
+      </w:r>
+      <w:proofErr w:type="spellStart"/>
+      <w:r>
+        <w:t>IDatabase</w:t>
+      </w:r>
+      <w:proofErr w:type="spellEnd"/>
+      <w:r>
+        <w:t xml:space="preserve"> interface to return true, and when you want to get the state back, you mock </w:t>
+      </w:r>
+      <w:proofErr w:type="spellStart"/>
+      <w:r>
+        <w:t>IDatabase</w:t>
+      </w:r>
+      <w:proofErr w:type="spellEnd"/>
+      <w:r>
+        <w:t xml:space="preserve"> again to return some phony object that you would normally expect at runtime. </w:t>
+      </w:r>
+      <w:r>
+        <w:t>This allows for the unit tests to actually test the method, and not the dependencies that method uses.</w:t>
+      </w:r>
+    </w:p>
+    <w:p>
+      <w:pPr>
+        <w:pStyle w:val="Heading2"/>
+      </w:pPr>
+      <w:r>
+        <w:t>Virtual STB Refactoring</w:t>
+      </w:r>
+    </w:p>
+    <w:p>
+      <w:r>
+        <w:t xml:space="preserve">While the server was being developed, Marshall was forced to stub methods and hardcode data until the server could produce real results that could be tested against. After many months of doing this, some refactoring had to be done to use real data from the server. David helped out with this by moving some of the protocol definitions into separate files and grouping those files into common folders. This improved some of the organization of the </w:t>
+      </w:r>
+      <w:proofErr w:type="spellStart"/>
+      <w:r>
+        <w:t>vSTB</w:t>
+      </w:r>
+      <w:proofErr w:type="spellEnd"/>
+      <w:r>
+        <w:t xml:space="preserve">, as well as speeding up compilation time. </w:t>
+      </w:r>
+    </w:p>
+    <w:p>
+      <w:pPr>
+        <w:pStyle w:val="Heading2"/>
+      </w:pPr>
+      <w:r>
+        <w:t>Virtual STB Drawing</w:t>
+      </w:r>
+    </w:p>
+    <w:p>
+      <w:r>
+        <w:t xml:space="preserve">To get checkers pieces to look like they are sitting on top of the board, Marshall had to look into drawing the images on top of each other, and doing so in an efficient way. </w:t>
+      </w:r>
+      <w:r>
+        <w:t>The end result was a very nice looking board where the piece images could be dynamically drawn on top of the tile images.</w:t>
+      </w:r>
+      <w:r>
+        <w:t xml:space="preserve"> Additionally he looked into QT style sheets to simplify palette logic on </w:t>
+      </w:r>
+      <w:proofErr w:type="spellStart"/>
+      <w:r>
+        <w:t>vSTB</w:t>
+      </w:r>
+      <w:proofErr w:type="spellEnd"/>
+      <w:r>
+        <w:t xml:space="preserve"> GUI Buttons.</w:t>
+      </w:r>
+    </w:p>
+    <w:p>
+      <w:pPr>
+        <w:pStyle w:val="Heading2"/>
+      </w:pPr>
+      <w:r>
+        <w:lastRenderedPageBreak/>
+        <w:t>Virtual STB Unit Testing</w:t>
+      </w:r>
+    </w:p>
+    <w:p>
+      <w:r>
+        <w:t xml:space="preserve">Marshall has been conducting ongoing research into </w:t>
+      </w:r>
+      <w:proofErr w:type="spellStart"/>
+      <w:r>
+        <w:t>Qt’s</w:t>
+      </w:r>
+      <w:proofErr w:type="spellEnd"/>
+      <w:r>
+        <w:t xml:space="preserve"> unit testing libraries. </w:t>
+      </w:r>
+      <w:proofErr w:type="spellStart"/>
+      <w:r>
+        <w:t>Qt’s</w:t>
+      </w:r>
+      <w:proofErr w:type="spellEnd"/>
+      <w:r>
+        <w:t xml:space="preserve"> provided documentation is rather trivial and doesn’t offer much explanation into the finer details of the provided libraries. Due to this, he has been looking into alternative tools that may simplify unit testing</w:t>
+      </w:r>
+      <w:r>
+        <w:t>.</w:t>
+      </w:r>
+    </w:p>
+    <w:p>
+      <w:pPr>
+        <w:pStyle w:val="Heading2"/>
+      </w:pPr>
+      <w:r>
+        <w:t>Checkers A.I.</w:t>
+      </w:r>
+    </w:p>
+    <w:p>
+      <w:r>
+        <w:t xml:space="preserve">Kevin has taken the Artificial Intelligence class on campus, so he was the obvious candidate to write the checkers AI portion. </w:t>
+      </w:r>
+      <w:r>
+        <w:t xml:space="preserve">In only a couple of days he had a fully working analyzer that would look three moves ahead and decide which move to pick. This level of difficulty is fairly easy to beat, but any more moves ahead </w:t>
+      </w:r>
+      <w:proofErr w:type="gramStart"/>
+      <w:r>
+        <w:t>causes</w:t>
+      </w:r>
+      <w:proofErr w:type="gramEnd"/>
+      <w:r>
+        <w:t xml:space="preserve"> a drastic increase in computation. He then looked into more optimizations and remembered what he had learned about Alpha Beta pruning, and had </w:t>
+      </w:r>
+      <w:r>
+        <w:t>that</w:t>
+      </w:r>
       <w:r>
         <w:t xml:space="preserve"> integrated in a short time. It did not help as much as he had hoped, but after some careful analysis, we decided that we would try some more optimizations next sprint. </w:t>
       </w:r>
@@ -970,7 +1208,7 @@
           <w:rPr>
             <w:noProof/>
           </w:rPr>
-          <w:t>5</w:t>
+          <w:t>2</w:t>
         </w:r>
         <w:r>
           <w:rPr>
@@ -2620,7 +2858,7 @@
 </file>
 
 <file path=customXml/itemProps1.xml><?xml version="1.0" encoding="utf-8"?>
-<ds:datastoreItem xmlns:ds="http://schemas.openxmlformats.org/officeDocument/2006/customXml" ds:itemID="{B06A2871-AD5C-4799-AA92-6081B2F6A5D7}">
+<ds:datastoreItem xmlns:ds="http://schemas.openxmlformats.org/officeDocument/2006/customXml" ds:itemID="{6B32E6A8-23B5-470A-874C-90E432908EF5}">
   <ds:schemaRefs>
     <ds:schemaRef ds:uri="http://schemas.openxmlformats.org/officeDocument/2006/bibliography"/>
   </ds:schemaRefs>

</xml_diff>